<commit_message>
docs: restore the dma, uart and i2c figure scripts; fix four figures
build_dma.py, build_uart.py and build_i2c.py were never committed: the
top-level build/ ignore rule hid new files under doc/build. Rebuilt from the
committed drawio and SVG files; each regenerates its figures byte for byte.
.gitignore now keeps doc/build visible.

Figures fixed (a stricter SVG check: wires through boxes, labels over
boxes): I2C block, the interrupt wire crossed the byte controller; UART
block, the RX wire crossed the modem box; I2C and UART, the clock label
covered the SCRC box; SYSDBG read handshake, the rising-edge label covered
both boxes. Drawings only; no text changed.
</commit_message>
<xml_diff>
--- a/doc/specs/docx/QNSC_SYSDBG_MAS.docx
+++ b/doc/specs/docx/QNSC_SYSDBG_MAS.docx
@@ -978,7 +978,7 @@
               <a:graphicData uri="http://schemas.openxmlformats.org/drawingml/2006/picture">
                 <pic:pic>
                   <pic:nvPicPr>
-                    <pic:cNvPr descr="../img/fig_sysdbg_block.png" id="31" name="Picture"/>
+                    <pic:cNvPr descr="../figures/img/fig_sysdbg_block.png" id="31" name="Picture"/>
                     <pic:cNvPicPr>
                       <a:picLocks noChangeArrowheads="1" noChangeAspect="1"/>
                     </pic:cNvPicPr>
@@ -4468,7 +4468,7 @@
               <a:graphicData uri="http://schemas.openxmlformats.org/drawingml/2006/picture">
                 <pic:pic>
                   <pic:nvPicPr>
-                    <pic:cNvPr descr="../img/fig_sysdbg_boot_wiring.png" id="39" name="Picture"/>
+                    <pic:cNvPr descr="../figures/img/fig_sysdbg_boot_wiring.png" id="39" name="Picture"/>
                     <pic:cNvPicPr>
                       <a:picLocks noChangeArrowheads="1" noChangeAspect="1"/>
                     </pic:cNvPicPr>
@@ -6080,7 +6080,7 @@
               <a:graphicData uri="http://schemas.openxmlformats.org/drawingml/2006/picture">
                 <pic:pic>
                   <pic:nvPicPr>
-                    <pic:cNvPr descr="../img/fig_sysdbg_handshake.png" id="45" name="Picture"/>
+                    <pic:cNvPr descr="../figures/img/fig_sysdbg_handshake.png" id="45" name="Picture"/>
                     <pic:cNvPicPr>
                       <a:picLocks noChangeArrowheads="1" noChangeAspect="1"/>
                     </pic:cNvPicPr>

</xml_diff>

<commit_message>
docs: restore the dma, uart and i2c figure scripts; fix four figures (#48)
build_dma.py, build_uart.py and build_i2c.py were never committed: the
top-level build/ ignore rule hid new files under doc/build. Rebuilt from the
committed drawio and SVG files; each regenerates its figures byte for byte.
.gitignore now keeps doc/build visible.

Figures fixed (a stricter SVG check: wires through boxes, labels over
boxes): I2C block, the interrupt wire crossed the byte controller; UART
block, the RX wire crossed the modem box; I2C and UART, the clock label
covered the SCRC box; SYSDBG read handshake, the rising-edge label covered
both boxes. Drawings only; no text changed.
</commit_message>
<xml_diff>
--- a/doc/specs/docx/QNSC_SYSDBG_MAS.docx
+++ b/doc/specs/docx/QNSC_SYSDBG_MAS.docx
@@ -978,7 +978,7 @@
               <a:graphicData uri="http://schemas.openxmlformats.org/drawingml/2006/picture">
                 <pic:pic>
                   <pic:nvPicPr>
-                    <pic:cNvPr descr="../img/fig_sysdbg_block.png" id="31" name="Picture"/>
+                    <pic:cNvPr descr="../figures/img/fig_sysdbg_block.png" id="31" name="Picture"/>
                     <pic:cNvPicPr>
                       <a:picLocks noChangeArrowheads="1" noChangeAspect="1"/>
                     </pic:cNvPicPr>
@@ -4468,7 +4468,7 @@
               <a:graphicData uri="http://schemas.openxmlformats.org/drawingml/2006/picture">
                 <pic:pic>
                   <pic:nvPicPr>
-                    <pic:cNvPr descr="../img/fig_sysdbg_boot_wiring.png" id="39" name="Picture"/>
+                    <pic:cNvPr descr="../figures/img/fig_sysdbg_boot_wiring.png" id="39" name="Picture"/>
                     <pic:cNvPicPr>
                       <a:picLocks noChangeArrowheads="1" noChangeAspect="1"/>
                     </pic:cNvPicPr>
@@ -6080,7 +6080,7 @@
               <a:graphicData uri="http://schemas.openxmlformats.org/drawingml/2006/picture">
                 <pic:pic>
                   <pic:nvPicPr>
-                    <pic:cNvPr descr="../img/fig_sysdbg_handshake.png" id="45" name="Picture"/>
+                    <pic:cNvPr descr="../figures/img/fig_sysdbg_handshake.png" id="45" name="Picture"/>
                     <pic:cNvPicPr>
                       <a:picLocks noChangeArrowheads="1" noChangeAspect="1"/>
                     </pic:cNvPicPr>

</xml_diff>